<commit_message>
update: hero text, GraviChoice link, mobile overflow fix, 妙笔成 project card, company name fix
</commit_message>
<xml_diff>
--- a/贺睿_杜伦大学_数据科学专业.docx
+++ b/贺睿_杜伦大学_数据科学专业.docx
@@ -33,10 +33,10 @@
           <wp:anchor distT="0" distB="0" distL="114300" distR="114300" simplePos="0" relativeHeight="251659264" behindDoc="0" locked="0" layoutInCell="1" allowOverlap="1">
             <wp:simplePos x="0" y="0"/>
             <wp:positionH relativeFrom="column">
-              <wp:posOffset>5248910</wp:posOffset>
+              <wp:posOffset>5375910</wp:posOffset>
             </wp:positionH>
             <wp:positionV relativeFrom="paragraph">
-              <wp:posOffset>-243205</wp:posOffset>
+              <wp:posOffset>-23495</wp:posOffset>
             </wp:positionV>
             <wp:extent cx="568325" cy="791845"/>
             <wp:effectExtent l="0" t="0" r="3175" b="8255"/>
@@ -95,16 +95,16 @@
           <w:tab w:val="left" w:pos="10290"/>
         </w:tabs>
         <w:spacing w:beforeAutospacing="0" w:after="0" w:afterAutospacing="0" w:line="240" w:lineRule="auto"/>
-        <w:ind w:left="-201" w:leftChars="-200" w:right="-13" w:rightChars="-6" w:hanging="219" w:hangingChars="122"/>
+        <w:ind w:left="-225" w:leftChars="-200" w:right="-13" w:rightChars="-6" w:hanging="195" w:hangingChars="122"/>
         <w:jc w:val="center"/>
         <w:rPr>
           <w:rFonts w:hint="eastAsia" w:ascii="微软雅黑" w:hAnsi="微软雅黑" w:eastAsia="微软雅黑" w:cs="微软雅黑"/>
-          <w:i w:val="0"/>
-          <w:iCs w:val="0"/>
-          <w:color w:val="auto"/>
-          <w:sz w:val="18"/>
-          <w:szCs w:val="18"/>
-          <w:lang w:eastAsia="zh-CN"/>
+          <w:b w:val="0"/>
+          <w:i w:val="0"/>
+          <w:iCs w:val="0"/>
+          <w:color w:val="auto"/>
+          <w:sz w:val="16"/>
+          <w:szCs w:val="16"/>
         </w:rPr>
       </w:pPr>
       <w:r>
@@ -114,8 +114,8 @@
           <w:i w:val="0"/>
           <w:iCs w:val="0"/>
           <w:color w:val="auto"/>
-          <w:sz w:val="18"/>
-          <w:szCs w:val="18"/>
+          <w:sz w:val="16"/>
+          <w:szCs w:val="16"/>
         </w:rPr>
         <w:t>(+86) 1</w:t>
       </w:r>
@@ -126,8 +126,8 @@
           <w:i w:val="0"/>
           <w:iCs w:val="0"/>
           <w:color w:val="auto"/>
-          <w:sz w:val="18"/>
-          <w:szCs w:val="18"/>
+          <w:sz w:val="16"/>
+          <w:szCs w:val="16"/>
           <w:lang w:val="en-US" w:eastAsia="zh-CN"/>
         </w:rPr>
         <w:t>51-1134-8153</w:t>
@@ -139,8 +139,8 @@
           <w:i w:val="0"/>
           <w:iCs w:val="0"/>
           <w:color w:val="auto"/>
-          <w:sz w:val="18"/>
-          <w:szCs w:val="18"/>
+          <w:sz w:val="16"/>
+          <w:szCs w:val="16"/>
         </w:rPr>
         <w:t xml:space="preserve">  ·  </w:t>
       </w:r>
@@ -151,11 +151,123 @@
           <w:i w:val="0"/>
           <w:iCs w:val="0"/>
           <w:color w:val="auto"/>
-          <w:sz w:val="18"/>
-          <w:szCs w:val="18"/>
+          <w:sz w:val="16"/>
+          <w:szCs w:val="16"/>
+          <w:u w:val="none"/>
           <w:lang w:val="en-US" w:eastAsia="zh-CN"/>
         </w:rPr>
         <w:t>chaosfrey@gmail.com</w:t>
+      </w:r>
+      <w:r>
+        <w:rPr>
+          <w:rFonts w:hint="eastAsia" w:ascii="微软雅黑" w:hAnsi="微软雅黑" w:eastAsia="微软雅黑" w:cs="微软雅黑"/>
+          <w:b w:val="0"/>
+          <w:i w:val="0"/>
+          <w:iCs w:val="0"/>
+          <w:color w:val="auto"/>
+          <w:sz w:val="16"/>
+          <w:szCs w:val="16"/>
+        </w:rPr>
+        <w:t xml:space="preserve"> </w:t>
+      </w:r>
+    </w:p>
+    <w:p>
+      <w:pPr>
+        <w:tabs>
+          <w:tab w:val="left" w:pos="10290"/>
+        </w:tabs>
+        <w:spacing w:beforeAutospacing="0" w:after="0" w:afterAutospacing="0" w:line="240" w:lineRule="auto"/>
+        <w:ind w:left="-225" w:leftChars="-200" w:right="-13" w:rightChars="-6" w:hanging="195" w:hangingChars="122"/>
+        <w:jc w:val="center"/>
+        <w:rPr>
+          <w:rFonts w:hint="default" w:cs="微软雅黑"/>
+          <w:b w:val="0"/>
+          <w:i w:val="0"/>
+          <w:iCs w:val="0"/>
+          <w:color w:val="auto"/>
+          <w:sz w:val="16"/>
+          <w:szCs w:val="16"/>
+          <w:lang w:val="en-US" w:eastAsia="zh-CN"/>
+        </w:rPr>
+      </w:pPr>
+      <w:r>
+        <w:rPr>
+          <w:rFonts w:hint="eastAsia" w:cs="微软雅黑"/>
+          <w:b w:val="0"/>
+          <w:i w:val="0"/>
+          <w:iCs w:val="0"/>
+          <w:color w:val="auto"/>
+          <w:sz w:val="16"/>
+          <w:szCs w:val="16"/>
+          <w:lang w:val="en-US" w:eastAsia="zh-CN"/>
+        </w:rPr>
+        <w:t>个人主页：</w:t>
+      </w:r>
+      <w:r>
+        <w:rPr>
+          <w:rFonts w:hint="eastAsia" w:cs="微软雅黑"/>
+          <w:b w:val="0"/>
+          <w:i w:val="0"/>
+          <w:iCs w:val="0"/>
+          <w:color w:val="auto"/>
+          <w:sz w:val="16"/>
+          <w:szCs w:val="16"/>
+          <w:lang w:val="en-US" w:eastAsia="zh-CN"/>
+        </w:rPr>
+        <w:fldChar w:fldCharType="begin"/>
+      </w:r>
+      <w:r>
+        <w:rPr>
+          <w:rFonts w:hint="eastAsia" w:cs="微软雅黑"/>
+          <w:b w:val="0"/>
+          <w:i w:val="0"/>
+          <w:iCs w:val="0"/>
+          <w:color w:val="auto"/>
+          <w:sz w:val="16"/>
+          <w:szCs w:val="16"/>
+          <w:lang w:val="en-US" w:eastAsia="zh-CN"/>
+        </w:rPr>
+        <w:instrText xml:space="preserve"> HYPERLINK "https://reina-portfolio.pages.dev/" </w:instrText>
+      </w:r>
+      <w:r>
+        <w:rPr>
+          <w:rFonts w:hint="eastAsia" w:cs="微软雅黑"/>
+          <w:b w:val="0"/>
+          <w:i w:val="0"/>
+          <w:iCs w:val="0"/>
+          <w:color w:val="auto"/>
+          <w:sz w:val="16"/>
+          <w:szCs w:val="16"/>
+          <w:lang w:val="en-US" w:eastAsia="zh-CN"/>
+        </w:rPr>
+        <w:fldChar w:fldCharType="separate"/>
+      </w:r>
+      <w:r>
+        <w:rPr>
+          <w:rStyle w:val="136"/>
+          <w:rFonts w:hint="eastAsia" w:cs="微软雅黑"/>
+          <w:b w:val="0"/>
+          <w:i w:val="0"/>
+          <w:iCs w:val="0"/>
+          <w:color w:val="auto"/>
+          <w:sz w:val="16"/>
+          <w:szCs w:val="16"/>
+          <w:lang w:val="en-US" w:eastAsia="zh-CN"/>
+        </w:rPr>
+        <w:t>https://reina-portfolio.pages.dev</w:t>
+      </w:r>
+      <w:r>
+        <w:rPr>
+          <w:rFonts w:hint="eastAsia" w:cs="微软雅黑"/>
+          <w:b w:val="0"/>
+          <w:i w:val="0"/>
+          <w:iCs w:val="0"/>
+          <w:color w:val="auto"/>
+          <w:sz w:val="16"/>
+          <w:szCs w:val="16"/>
+          <w:lang w:val="en-US" w:eastAsia="zh-CN"/>
+        </w:rPr>
+        <w:fldChar w:fldCharType="end"/>
       </w:r>
     </w:p>
     <w:p>
@@ -248,7 +360,7 @@
           <w:szCs w:val="18"/>
           <w:lang w:val="en-US" w:eastAsia="zh-CN"/>
         </w:rPr>
-        <w:t xml:space="preserve">                       </w:t>
+        <w:t xml:space="preserve">                         </w:t>
       </w:r>
       <w:r>
         <w:rPr>
@@ -260,22 +372,9 @@
           <w:color w:val="auto"/>
           <w:sz w:val="18"/>
           <w:szCs w:val="18"/>
-        </w:rPr>
-        <w:t xml:space="preserve">数据科学 | </w:t>
-      </w:r>
-      <w:r>
-        <w:rPr>
-          <w:rFonts w:hint="eastAsia" w:cs="微软雅黑"/>
-          <w:b/>
-          <w:bCs w:val="0"/>
-          <w:i w:val="0"/>
-          <w:iCs w:val="0"/>
-          <w:color w:val="auto"/>
-          <w:sz w:val="18"/>
-          <w:szCs w:val="18"/>
-          <w:lang w:val="en-US" w:eastAsia="zh-CN"/>
-        </w:rPr>
-        <w:t>硕士</w:t>
+          <w:lang w:val="en-US" w:eastAsia="zh-CN" w:bidi="ar-SA"/>
+        </w:rPr>
+        <w:t>数据科学 | 硕士</w:t>
       </w:r>
       <w:r>
         <w:rPr>
@@ -459,7 +558,7 @@
           <w:szCs w:val="18"/>
           <w:lang w:val="en-US" w:eastAsia="zh-CN"/>
         </w:rPr>
-        <w:t xml:space="preserve">                                      </w:t>
+        <w:t xml:space="preserve">                                        </w:t>
       </w:r>
       <w:r>
         <w:rPr>
@@ -664,7 +763,7 @@
           <w:szCs w:val="18"/>
           <w:lang w:val="en-US" w:eastAsia="zh-CN"/>
         </w:rPr>
-        <w:t xml:space="preserve">ACG事业群）                                       </w:t>
+        <w:t xml:space="preserve">ACG事业群）                                                          </w:t>
       </w:r>
       <w:r>
         <w:rPr>
@@ -677,32 +776,6 @@
           <w:szCs w:val="18"/>
         </w:rPr>
         <w:t>AI 产品经理</w:t>
-      </w:r>
-      <w:r>
-        <w:rPr>
-          <w:rFonts w:hint="eastAsia" w:cs="微软雅黑"/>
-          <w:b/>
-          <w:i w:val="0"/>
-          <w:iCs w:val="0"/>
-          <w:color w:val="auto"/>
-          <w:sz w:val="18"/>
-          <w:szCs w:val="18"/>
-          <w:lang w:eastAsia="zh-CN"/>
-        </w:rPr>
-        <w:t>（</w:t>
-      </w:r>
-      <w:r>
-        <w:rPr>
-          <w:rFonts w:hint="eastAsia" w:cs="微软雅黑"/>
-          <w:b/>
-          <w:i w:val="0"/>
-          <w:iCs w:val="0"/>
-          <w:color w:val="auto"/>
-          <w:sz w:val="18"/>
-          <w:szCs w:val="18"/>
-          <w:lang w:val="en-US" w:eastAsia="zh-CN"/>
-        </w:rPr>
-        <w:t>金融智能客服方向）</w:t>
       </w:r>
       <w:r>
         <w:rPr>
@@ -847,11 +920,39 @@
           <w:sz w:val="18"/>
           <w:szCs w:val="18"/>
         </w:rPr>
-        <w:t>针对金融贷款</w:t>
+        <w:t>针对</w:t>
+      </w:r>
+      <w:r>
+        <w:rPr>
+          <w:rFonts w:hint="eastAsia" w:ascii="微软雅黑" w:hAnsi="微软雅黑" w:eastAsia="微软雅黑" w:cs="微软雅黑"/>
+          <w:b/>
+          <w:bCs w:val="0"/>
+          <w:i w:val="0"/>
+          <w:iCs w:val="0"/>
+          <w:color w:val="auto"/>
+          <w:sz w:val="18"/>
+          <w:szCs w:val="18"/>
+          <w:lang w:val="en-US" w:eastAsia="zh-CN"/>
+        </w:rPr>
+        <w:t>金融智能客服</w:t>
       </w:r>
       <w:r>
         <w:rPr>
           <w:rFonts w:hint="eastAsia" w:cs="微软雅黑"/>
+          <w:b/>
+          <w:bCs w:val="0"/>
+          <w:i w:val="0"/>
+          <w:iCs w:val="0"/>
+          <w:color w:val="auto"/>
+          <w:sz w:val="18"/>
+          <w:szCs w:val="18"/>
+          <w:lang w:val="en-US" w:eastAsia="zh-CN"/>
+        </w:rPr>
+        <w:t>产品</w:t>
+      </w:r>
+      <w:r>
+        <w:rPr>
+          <w:rFonts w:hint="eastAsia" w:cs="微软雅黑"/>
           <w:b w:val="0"/>
           <w:bCs/>
           <w:i w:val="0"/>
@@ -861,7 +962,7 @@
           <w:szCs w:val="18"/>
           <w:lang w:val="en-US" w:eastAsia="zh-CN"/>
         </w:rPr>
-        <w:t>业务的高风险性</w:t>
+        <w:t>的行业高风险性</w:t>
       </w:r>
       <w:r>
         <w:rPr>
@@ -1962,7 +2063,7 @@
           <w:szCs w:val="18"/>
           <w:lang w:val="en-US" w:eastAsia="zh-CN"/>
         </w:rPr>
-        <w:t>跟进3项功能的评审与落地，降低</w:t>
+        <w:t>跟进3项功能的评审与落地，预计降低</w:t>
       </w:r>
       <w:r>
         <w:rPr>
@@ -2063,7 +2164,7 @@
           <w:szCs w:val="18"/>
           <w:lang w:val="en-US" w:eastAsia="zh-CN"/>
         </w:rPr>
-        <w:t xml:space="preserve">                                          </w:t>
+        <w:t xml:space="preserve">                                                 </w:t>
       </w:r>
       <w:r>
         <w:rPr>
@@ -2076,22 +2177,7 @@
           <w:sz w:val="18"/>
           <w:szCs w:val="18"/>
         </w:rPr>
-        <w:t>咨询</w:t>
-      </w:r>
-      <w:bookmarkStart w:id="0" w:name="_GoBack"/>
-      <w:bookmarkEnd w:id="0"/>
-      <w:r>
-        <w:rPr>
-          <w:rFonts w:hint="eastAsia" w:ascii="微软雅黑" w:hAnsi="微软雅黑" w:eastAsia="微软雅黑" w:cs="微软雅黑"/>
-          <w:b/>
-          <w:bCs/>
-          <w:i w:val="0"/>
-          <w:iCs w:val="0"/>
-          <w:color w:val="auto"/>
-          <w:sz w:val="18"/>
-          <w:szCs w:val="18"/>
-        </w:rPr>
-        <w:t>顾问</w:t>
+        <w:t>咨询顾问</w:t>
       </w:r>
       <w:r>
         <w:rPr>
@@ -2774,7 +2860,7 @@
           <w:szCs w:val="18"/>
           <w:lang w:val="en-US" w:eastAsia="zh-CN"/>
         </w:rPr>
-        <w:t xml:space="preserve">                                      AI Coding项目</w:t>
+        <w:t xml:space="preserve">                                             AI Coding项目</w:t>
       </w:r>
       <w:r>
         <w:rPr>
@@ -3046,6 +3132,20 @@
       </w:r>
       <w:r>
         <w:rPr>
+          <w:rFonts w:hint="eastAsia" w:cs="微软雅黑"/>
+          <w:b w:val="0"/>
+          <w:bCs/>
+          <w:i w:val="0"/>
+          <w:iCs w:val="0"/>
+          <w:color w:val="auto"/>
+          <w:sz w:val="18"/>
+          <w:szCs w:val="18"/>
+          <w:lang w:val="en-US" w:eastAsia="zh-CN"/>
+        </w:rPr>
+        <w:t>xx</w:t>
+      </w:r>
+      <w:r>
+        <w:rPr>
           <w:rFonts w:hint="eastAsia" w:ascii="微软雅黑" w:hAnsi="微软雅黑" w:eastAsia="微软雅黑" w:cs="微软雅黑"/>
           <w:b w:val="0"/>
           <w:bCs/>
@@ -3055,7 +3155,21 @@
           <w:sz w:val="18"/>
           <w:szCs w:val="18"/>
         </w:rPr>
-        <w:t>转行”）分别输入优势（Pros）与劣势（Cons）描述</w:t>
+        <w:t>”）分别输入</w:t>
+      </w:r>
+      <w:r>
+        <w:rPr>
+          <w:rFonts w:hint="eastAsia" w:cs="微软雅黑"/>
+          <w:b w:val="0"/>
+          <w:bCs/>
+          <w:i w:val="0"/>
+          <w:iCs w:val="0"/>
+          <w:color w:val="auto"/>
+          <w:sz w:val="18"/>
+          <w:szCs w:val="18"/>
+          <w:lang w:val="en-US" w:eastAsia="zh-CN"/>
+        </w:rPr>
+        <w:t>有利</w:t>
       </w:r>
       <w:r>
         <w:rPr>
@@ -3067,13 +3181,53 @@
           <w:color w:val="auto"/>
           <w:sz w:val="18"/>
           <w:szCs w:val="18"/>
+        </w:rPr>
+        <w:t>与</w:t>
+      </w:r>
+      <w:r>
+        <w:rPr>
+          <w:rFonts w:hint="eastAsia" w:cs="微软雅黑"/>
+          <w:b w:val="0"/>
+          <w:bCs/>
+          <w:i w:val="0"/>
+          <w:iCs w:val="0"/>
+          <w:color w:val="auto"/>
+          <w:sz w:val="18"/>
+          <w:szCs w:val="18"/>
+          <w:lang w:val="en-US" w:eastAsia="zh-CN"/>
+        </w:rPr>
+        <w:t>不利项</w:t>
+      </w:r>
+      <w:r>
+        <w:rPr>
+          <w:rFonts w:hint="eastAsia" w:ascii="微软雅黑" w:hAnsi="微软雅黑" w:eastAsia="微软雅黑" w:cs="微软雅黑"/>
+          <w:b w:val="0"/>
+          <w:bCs/>
+          <w:i w:val="0"/>
+          <w:iCs w:val="0"/>
+          <w:color w:val="auto"/>
+          <w:sz w:val="18"/>
+          <w:szCs w:val="18"/>
+        </w:rPr>
+        <w:t>描述</w:t>
+      </w:r>
+      <w:r>
+        <w:rPr>
+          <w:rFonts w:hint="eastAsia" w:ascii="微软雅黑" w:hAnsi="微软雅黑" w:eastAsia="微软雅黑" w:cs="微软雅黑"/>
+          <w:b w:val="0"/>
+          <w:bCs/>
+          <w:i w:val="0"/>
+          <w:iCs w:val="0"/>
+          <w:color w:val="auto"/>
+          <w:sz w:val="18"/>
+          <w:szCs w:val="18"/>
           <w:lang w:eastAsia="zh-CN"/>
         </w:rPr>
         <w:t>，</w:t>
       </w:r>
       <w:r>
         <w:rPr>
-          <w:rFonts w:hint="eastAsia" w:ascii="微软雅黑" w:hAnsi="微软雅黑" w:eastAsia="微软雅黑" w:cs="微软雅黑"/>
+          <w:rFonts w:hint="eastAsia" w:cs="微软雅黑"/>
           <w:b w:val="0"/>
           <w:bCs/>
           <w:i w:val="0"/>
@@ -3081,8 +3235,9 @@
           <w:color w:val="auto"/>
           <w:sz w:val="18"/>
           <w:szCs w:val="18"/>
-        </w:rPr>
-        <w:t>接入</w:t>
+          <w:lang w:val="en-US" w:eastAsia="zh-CN"/>
+        </w:rPr>
+        <w:t>通过</w:t>
       </w:r>
       <w:r>
         <w:rPr>
@@ -3313,7 +3468,63 @@
           <w:szCs w:val="18"/>
           <w:lang w:val="en-US" w:eastAsia="zh-CN"/>
         </w:rPr>
-        <w:t>与Figma 完成前端界面设计，使用Claude Code 实现前后端联动；部署至Vercel。</w:t>
+        <w:t>与Figma 完成前端界面设计，使用Claude Code 实现前后端联动</w:t>
+      </w:r>
+      <w:r>
+        <w:rPr>
+          <w:rFonts w:hint="eastAsia" w:cs="微软雅黑"/>
+          <w:b w:val="0"/>
+          <w:bCs/>
+          <w:i w:val="0"/>
+          <w:iCs w:val="0"/>
+          <w:color w:val="auto"/>
+          <w:sz w:val="18"/>
+          <w:szCs w:val="18"/>
+          <w:lang w:val="en-US" w:eastAsia="zh-CN"/>
+        </w:rPr>
+        <w:t>；</w:t>
+      </w:r>
+      <w:r>
+        <w:rPr>
+          <w:rFonts w:hint="eastAsia" w:ascii="微软雅黑" w:hAnsi="微软雅黑" w:eastAsia="微软雅黑" w:cs="微软雅黑"/>
+          <w:b w:val="0"/>
+          <w:bCs/>
+          <w:i w:val="0"/>
+          <w:iCs w:val="0"/>
+          <w:color w:val="auto"/>
+          <w:sz w:val="18"/>
+          <w:szCs w:val="18"/>
+          <w:lang w:val="en-US" w:eastAsia="zh-CN"/>
+        </w:rPr>
+        <w:t>部署至Vercel</w:t>
+      </w:r>
+      <w:r>
+        <w:rPr>
+          <w:rFonts w:hint="eastAsia" w:cs="微软雅黑"/>
+          <w:b w:val="0"/>
+          <w:bCs/>
+          <w:i w:val="0"/>
+          <w:iCs w:val="0"/>
+          <w:color w:val="auto"/>
+          <w:sz w:val="18"/>
+          <w:szCs w:val="18"/>
+          <w:lang w:val="en-US" w:eastAsia="zh-CN"/>
+        </w:rPr>
+        <w:t>与Cloudflare</w:t>
+      </w:r>
+      <w:r>
+        <w:rPr>
+          <w:rFonts w:hint="eastAsia" w:ascii="微软雅黑" w:hAnsi="微软雅黑" w:eastAsia="微软雅黑" w:cs="微软雅黑"/>
+          <w:b w:val="0"/>
+          <w:bCs/>
+          <w:i w:val="0"/>
+          <w:iCs w:val="0"/>
+          <w:color w:val="auto"/>
+          <w:sz w:val="18"/>
+          <w:szCs w:val="18"/>
+          <w:lang w:val="en-US" w:eastAsia="zh-CN"/>
+        </w:rPr>
+        <w:t>。</w:t>
       </w:r>
     </w:p>
     <w:p>
@@ -3362,7 +3573,22 @@
           <w:szCs w:val="18"/>
           <w:lang w:val="en-US" w:eastAsia="zh-CN"/>
         </w:rPr>
-        <w:t xml:space="preserve">                         课题研究</w:t>
+        <w:t xml:space="preserve">                            </w:t>
+      </w:r>
+      <w:bookmarkStart w:id="0" w:name="_GoBack"/>
+      <w:bookmarkEnd w:id="0"/>
+      <w:r>
+        <w:rPr>
+          <w:rFonts w:hint="eastAsia" w:cs="微软雅黑"/>
+          <w:b/>
+          <w:i w:val="0"/>
+          <w:iCs w:val="0"/>
+          <w:color w:val="auto"/>
+          <w:sz w:val="18"/>
+          <w:szCs w:val="18"/>
+          <w:lang w:val="en-US" w:eastAsia="zh-CN"/>
+        </w:rPr>
+        <w:t xml:space="preserve">     课题研究</w:t>
       </w:r>
       <w:r>
         <w:rPr>
@@ -3469,7 +3695,7 @@
           <w:szCs w:val="18"/>
           <w:lang w:val="en-US" w:eastAsia="zh-CN"/>
         </w:rPr>
-        <w:t>Pandas 处理结构化数据集；实施 Label/One-Hot Encoding 及特征缩放，优化模型收敛速度并提升特征表达能力。</w:t>
+        <w:t>Pandas 处理数据集；实施 Label/One-Hot Encoding 及特征缩放，优化模型收敛速度并提升特征表达能力。</w:t>
       </w:r>
     </w:p>
     <w:p>
@@ -4027,7 +4253,75 @@
           <w:szCs w:val="18"/>
           <w:lang w:val="en-US" w:eastAsia="zh-CN"/>
         </w:rPr>
-        <w:t>(数据处理-Pandas/NumPy、可视化-Matplotlib/seaborn、机器学习算法框架、网页爬虫与解析)，熟练掌握SQL、Tableau</w:t>
+        <w:t>(数据处理-Pandas/NumPy、可视化-Matplotlib/seaborn、机器学习算法框架、网页爬虫与解析)，熟练掌握</w:t>
+      </w:r>
+      <w:r>
+        <w:rPr>
+          <w:rFonts w:hint="eastAsia" w:ascii="微软雅黑" w:hAnsi="微软雅黑" w:eastAsia="微软雅黑" w:cs="微软雅黑"/>
+          <w:b/>
+          <w:bCs w:val="0"/>
+          <w:i w:val="0"/>
+          <w:iCs w:val="0"/>
+          <w:color w:val="auto"/>
+          <w:sz w:val="18"/>
+          <w:szCs w:val="18"/>
+          <w:lang w:val="en-US" w:eastAsia="zh-CN"/>
+        </w:rPr>
+        <w:t>SQL</w:t>
+      </w:r>
+      <w:r>
+        <w:rPr>
+          <w:rFonts w:hint="eastAsia" w:ascii="微软雅黑" w:hAnsi="微软雅黑" w:eastAsia="微软雅黑" w:cs="微软雅黑"/>
+          <w:b w:val="0"/>
+          <w:bCs/>
+          <w:i w:val="0"/>
+          <w:iCs w:val="0"/>
+          <w:color w:val="auto"/>
+          <w:sz w:val="18"/>
+          <w:szCs w:val="18"/>
+          <w:lang w:val="en-US" w:eastAsia="zh-CN"/>
+        </w:rPr>
+        <w:t>、Tableau</w:t>
+      </w:r>
+    </w:p>
+    <w:p>
+      <w:pPr>
+        <w:numPr>
+          <w:ilvl w:val="0"/>
+          <w:numId w:val="7"/>
+        </w:numPr>
+        <w:tabs>
+          <w:tab w:val="left" w:pos="10290"/>
+          <w:tab w:val="clear" w:pos="420"/>
+        </w:tabs>
+        <w:spacing w:beforeAutospacing="0" w:after="0" w:afterAutospacing="0" w:line="240" w:lineRule="auto"/>
+        <w:ind w:left="-201" w:leftChars="-200" w:right="-13" w:rightChars="-6" w:hanging="219" w:hangingChars="122"/>
+        <w:jc w:val="both"/>
+        <w:rPr>
+          <w:rFonts w:hint="default" w:ascii="微软雅黑" w:hAnsi="微软雅黑" w:eastAsia="微软雅黑" w:cs="微软雅黑"/>
+          <w:b w:val="0"/>
+          <w:bCs/>
+          <w:i w:val="0"/>
+          <w:iCs w:val="0"/>
+          <w:color w:val="auto"/>
+          <w:sz w:val="18"/>
+          <w:szCs w:val="18"/>
+          <w:lang w:val="en-US" w:eastAsia="zh-CN"/>
+        </w:rPr>
+      </w:pPr>
+      <w:r>
+        <w:rPr>
+          <w:rFonts w:hint="default" w:ascii="微软雅黑" w:hAnsi="微软雅黑" w:eastAsia="微软雅黑" w:cs="微软雅黑"/>
+          <w:b w:val="0"/>
+          <w:bCs/>
+          <w:i w:val="0"/>
+          <w:iCs w:val="0"/>
+          <w:color w:val="auto"/>
+          <w:sz w:val="18"/>
+          <w:szCs w:val="18"/>
+          <w:lang w:val="en-US" w:eastAsia="zh-CN"/>
+        </w:rPr>
+        <w:t>了解 Transformer 架构、RAG 检索增强、Prompt Engineering 等大模型核心机制及其在产品设计中的应用边界</w:t>
       </w:r>
     </w:p>
     <w:p>
@@ -4081,7 +4375,63 @@
           <w:szCs w:val="18"/>
           <w:lang w:val="en-US" w:eastAsia="zh-CN"/>
         </w:rPr>
-        <w:t>Claude code（熟练应用MCP/Skill）、cursor、trae、codex</w:t>
+        <w:t>Claude code（熟练应用MCP/Skill）、cursor、</w:t>
+      </w:r>
+      <w:r>
+        <w:rPr>
+          <w:rFonts w:hint="eastAsia" w:cs="微软雅黑"/>
+          <w:b w:val="0"/>
+          <w:bCs/>
+          <w:i w:val="0"/>
+          <w:iCs w:val="0"/>
+          <w:color w:val="auto"/>
+          <w:sz w:val="18"/>
+          <w:szCs w:val="18"/>
+          <w:lang w:val="en-US" w:eastAsia="zh-CN"/>
+        </w:rPr>
+        <w:t>Antigravity、T</w:t>
+      </w:r>
+      <w:r>
+        <w:rPr>
+          <w:rFonts w:hint="eastAsia" w:ascii="微软雅黑" w:hAnsi="微软雅黑" w:eastAsia="微软雅黑" w:cs="微软雅黑"/>
+          <w:b w:val="0"/>
+          <w:bCs/>
+          <w:i w:val="0"/>
+          <w:iCs w:val="0"/>
+          <w:color w:val="auto"/>
+          <w:sz w:val="18"/>
+          <w:szCs w:val="18"/>
+          <w:lang w:val="en-US" w:eastAsia="zh-CN"/>
+        </w:rPr>
+        <w:t>rae、</w:t>
+      </w:r>
+      <w:r>
+        <w:rPr>
+          <w:rFonts w:hint="eastAsia" w:cs="微软雅黑"/>
+          <w:b w:val="0"/>
+          <w:bCs/>
+          <w:i w:val="0"/>
+          <w:iCs w:val="0"/>
+          <w:color w:val="auto"/>
+          <w:sz w:val="18"/>
+          <w:szCs w:val="18"/>
+          <w:lang w:val="en-US" w:eastAsia="zh-CN"/>
+        </w:rPr>
+        <w:t>C</w:t>
+      </w:r>
+      <w:r>
+        <w:rPr>
+          <w:rFonts w:hint="eastAsia" w:ascii="微软雅黑" w:hAnsi="微软雅黑" w:eastAsia="微软雅黑" w:cs="微软雅黑"/>
+          <w:b w:val="0"/>
+          <w:bCs/>
+          <w:i w:val="0"/>
+          <w:iCs w:val="0"/>
+          <w:color w:val="auto"/>
+          <w:sz w:val="18"/>
+          <w:szCs w:val="18"/>
+          <w:lang w:val="en-US" w:eastAsia="zh-CN"/>
+        </w:rPr>
+        <w:t>odex</w:t>
       </w:r>
     </w:p>
     <w:p>
@@ -4135,7 +4485,35 @@
           <w:szCs w:val="18"/>
           <w:lang w:val="en-US" w:eastAsia="zh-CN"/>
         </w:rPr>
-        <w:t>Axure/Figma、XMind</w:t>
+        <w:t>Axure/Figma、</w:t>
+      </w:r>
+      <w:r>
+        <w:rPr>
+          <w:rFonts w:hint="eastAsia" w:cs="微软雅黑"/>
+          <w:b w:val="0"/>
+          <w:bCs/>
+          <w:i w:val="0"/>
+          <w:iCs w:val="0"/>
+          <w:color w:val="auto"/>
+          <w:sz w:val="18"/>
+          <w:szCs w:val="18"/>
+          <w:lang w:val="en-US" w:eastAsia="zh-CN"/>
+        </w:rPr>
+        <w:t>Google AI Studio、Stitch、</w:t>
+      </w:r>
+      <w:r>
+        <w:rPr>
+          <w:rFonts w:hint="eastAsia" w:ascii="微软雅黑" w:hAnsi="微软雅黑" w:eastAsia="微软雅黑" w:cs="微软雅黑"/>
+          <w:b w:val="0"/>
+          <w:bCs/>
+          <w:i w:val="0"/>
+          <w:iCs w:val="0"/>
+          <w:color w:val="auto"/>
+          <w:sz w:val="18"/>
+          <w:szCs w:val="18"/>
+          <w:lang w:val="en-US" w:eastAsia="zh-CN"/>
+        </w:rPr>
+        <w:t>XMind</w:t>
       </w:r>
     </w:p>
     <w:p>
@@ -4194,8 +4572,9 @@
     </w:p>
     <w:sectPr>
       <w:pgSz w:w="11906" w:h="16838"/>
-      <w:pgMar w:top="470" w:right="806" w:bottom="850" w:left="1020" w:header="720" w:footer="720" w:gutter="0"/>
-      <w:cols w:space="720" w:num="1"/>
+      <w:pgMar w:top="697" w:right="806" w:bottom="408" w:left="1020" w:header="720" w:footer="720" w:gutter="0"/>
+      <w:cols w:space="0" w:num="1"/>
+      <w:rtlGutter w:val="0"/>
       <w:docGrid w:linePitch="360" w:charSpace="0"/>
     </w:sectPr>
   </w:body>
@@ -4697,7 +5076,7 @@
     <w:name w:val="heading 1"/>
     <w:basedOn w:val="1"/>
     <w:next w:val="1"/>
-    <w:link w:val="139"/>
+    <w:link w:val="140"/>
     <w:qFormat/>
     <w:uiPriority w:val="9"/>
     <w:pPr>
@@ -4719,7 +5098,7 @@
     <w:name w:val="heading 2"/>
     <w:basedOn w:val="1"/>
     <w:next w:val="1"/>
-    <w:link w:val="140"/>
+    <w:link w:val="141"/>
     <w:unhideWhenUsed/>
     <w:qFormat/>
     <w:uiPriority w:val="9"/>
@@ -4747,7 +5126,7 @@
     <w:name w:val="heading 3"/>
     <w:basedOn w:val="1"/>
     <w:next w:val="1"/>
-    <w:link w:val="141"/>
+    <w:link w:val="142"/>
     <w:unhideWhenUsed/>
     <w:qFormat/>
     <w:uiPriority w:val="9"/>
@@ -4773,7 +5152,7 @@
     <w:name w:val="heading 4"/>
     <w:basedOn w:val="1"/>
     <w:next w:val="1"/>
-    <w:link w:val="151"/>
+    <w:link w:val="152"/>
     <w:semiHidden/>
     <w:unhideWhenUsed/>
     <w:qFormat/>
@@ -4802,7 +5181,7 @@
     <w:name w:val="heading 5"/>
     <w:basedOn w:val="1"/>
     <w:next w:val="1"/>
-    <w:link w:val="152"/>
+    <w:link w:val="153"/>
     <w:semiHidden/>
     <w:unhideWhenUsed/>
     <w:qFormat/>
@@ -4822,7 +5201,7 @@
     <w:name w:val="heading 6"/>
     <w:basedOn w:val="1"/>
     <w:next w:val="1"/>
-    <w:link w:val="153"/>
+    <w:link w:val="154"/>
     <w:semiHidden/>
     <w:unhideWhenUsed/>
     <w:qFormat/>
@@ -4844,7 +5223,7 @@
     <w:name w:val="heading 7"/>
     <w:basedOn w:val="1"/>
     <w:next w:val="1"/>
-    <w:link w:val="154"/>
+    <w:link w:val="155"/>
     <w:semiHidden/>
     <w:unhideWhenUsed/>
     <w:qFormat/>
@@ -4874,7 +5253,7 @@
     <w:name w:val="heading 8"/>
     <w:basedOn w:val="1"/>
     <w:next w:val="1"/>
-    <w:link w:val="155"/>
+    <w:link w:val="156"/>
     <w:semiHidden/>
     <w:unhideWhenUsed/>
     <w:qFormat/>
@@ -4901,7 +5280,7 @@
     <w:name w:val="heading 9"/>
     <w:basedOn w:val="1"/>
     <w:next w:val="1"/>
-    <w:link w:val="156"/>
+    <w:link w:val="157"/>
     <w:semiHidden/>
     <w:unhideWhenUsed/>
     <w:qFormat/>
@@ -4953,7 +5332,7 @@
   </w:style>
   <w:style w:type="paragraph" w:styleId="2">
     <w:name w:val="macro"/>
-    <w:link w:val="148"/>
+    <w:link w:val="149"/>
     <w:unhideWhenUsed/>
     <w:qFormat/>
     <w:uiPriority w:val="99"/>
@@ -5056,7 +5435,7 @@
   <w:style w:type="paragraph" w:styleId="17">
     <w:name w:val="Body Text 3"/>
     <w:basedOn w:val="1"/>
-    <w:link w:val="147"/>
+    <w:link w:val="148"/>
     <w:unhideWhenUsed/>
     <w:qFormat/>
     <w:uiPriority w:val="99"/>
@@ -5085,7 +5464,7 @@
   <w:style w:type="paragraph" w:styleId="19">
     <w:name w:val="Body Text"/>
     <w:basedOn w:val="1"/>
-    <w:link w:val="145"/>
+    <w:link w:val="146"/>
     <w:unhideWhenUsed/>
     <w:qFormat/>
     <w:uiPriority w:val="99"/>
@@ -5147,7 +5526,7 @@
   <w:style w:type="paragraph" w:styleId="24">
     <w:name w:val="footer"/>
     <w:basedOn w:val="1"/>
-    <w:link w:val="137"/>
+    <w:link w:val="138"/>
     <w:unhideWhenUsed/>
     <w:qFormat/>
     <w:uiPriority w:val="99"/>
@@ -5162,7 +5541,7 @@
   <w:style w:type="paragraph" w:styleId="25">
     <w:name w:val="header"/>
     <w:basedOn w:val="1"/>
-    <w:link w:val="136"/>
+    <w:link w:val="137"/>
     <w:unhideWhenUsed/>
     <w:qFormat/>
     <w:uiPriority w:val="99"/>
@@ -5178,7 +5557,7 @@
     <w:name w:val="Subtitle"/>
     <w:basedOn w:val="1"/>
     <w:next w:val="1"/>
-    <w:link w:val="143"/>
+    <w:link w:val="144"/>
     <w:qFormat/>
     <w:uiPriority w:val="11"/>
     <w:rPr>
@@ -5209,7 +5588,7 @@
   <w:style w:type="paragraph" w:styleId="28">
     <w:name w:val="Body Text 2"/>
     <w:basedOn w:val="1"/>
-    <w:link w:val="146"/>
+    <w:link w:val="147"/>
     <w:unhideWhenUsed/>
     <w:qFormat/>
     <w:uiPriority w:val="99"/>
@@ -5262,7 +5641,7 @@
     <w:name w:val="Title"/>
     <w:basedOn w:val="1"/>
     <w:next w:val="1"/>
-    <w:link w:val="142"/>
+    <w:link w:val="143"/>
     <w:qFormat/>
     <w:uiPriority w:val="10"/>
     <w:pPr>
@@ -16812,21 +17191,32 @@
       <w:iCs/>
     </w:rPr>
   </w:style>
-  <w:style w:type="character" w:customStyle="1" w:styleId="136">
+  <w:style w:type="character" w:styleId="136">
+    <w:name w:val="Hyperlink"/>
+    <w:basedOn w:val="133"/>
+    <w:semiHidden/>
+    <w:unhideWhenUsed/>
+    <w:uiPriority w:val="99"/>
+    <w:rPr>
+      <w:color w:val="0000FF"/>
+      <w:u w:val="single"/>
+    </w:rPr>
+  </w:style>
+  <w:style w:type="character" w:customStyle="1" w:styleId="137">
     <w:name w:val="Header Char"/>
     <w:basedOn w:val="133"/>
     <w:link w:val="25"/>
     <w:qFormat/>
     <w:uiPriority w:val="99"/>
   </w:style>
-  <w:style w:type="character" w:customStyle="1" w:styleId="137">
+  <w:style w:type="character" w:customStyle="1" w:styleId="138">
     <w:name w:val="Footer Char"/>
     <w:basedOn w:val="133"/>
     <w:link w:val="24"/>
     <w:qFormat/>
     <w:uiPriority w:val="99"/>
   </w:style>
-  <w:style w:type="paragraph" w:styleId="138">
+  <w:style w:type="paragraph" w:styleId="139">
     <w:name w:val="No Spacing"/>
     <w:qFormat/>
     <w:uiPriority w:val="1"/>
@@ -16840,7 +17230,7 @@
       <w:lang w:val="en-US" w:eastAsia="en-US" w:bidi="ar-SA"/>
     </w:rPr>
   </w:style>
-  <w:style w:type="character" w:customStyle="1" w:styleId="139">
+  <w:style w:type="character" w:customStyle="1" w:styleId="140">
     <w:name w:val="Heading 1 Char"/>
     <w:basedOn w:val="133"/>
     <w:link w:val="3"/>
@@ -16855,7 +17245,7 @@
       <w:szCs w:val="28"/>
     </w:rPr>
   </w:style>
-  <w:style w:type="character" w:customStyle="1" w:styleId="140">
+  <w:style w:type="character" w:customStyle="1" w:styleId="141">
     <w:name w:val="Heading 2 Char"/>
     <w:basedOn w:val="133"/>
     <w:link w:val="4"/>
@@ -16875,7 +17265,7 @@
       </w14:textFill>
     </w:rPr>
   </w:style>
-  <w:style w:type="character" w:customStyle="1" w:styleId="141">
+  <w:style w:type="character" w:customStyle="1" w:styleId="142">
     <w:name w:val="Heading 3 Char"/>
     <w:basedOn w:val="133"/>
     <w:link w:val="5"/>
@@ -16893,7 +17283,7 @@
       </w14:textFill>
     </w:rPr>
   </w:style>
-  <w:style w:type="character" w:customStyle="1" w:styleId="142">
+  <w:style w:type="character" w:customStyle="1" w:styleId="143">
     <w:name w:val="Title Char"/>
     <w:basedOn w:val="133"/>
     <w:link w:val="32"/>
@@ -16908,7 +17298,7 @@
       <w:szCs w:val="52"/>
     </w:rPr>
   </w:style>
-  <w:style w:type="character" w:customStyle="1" w:styleId="143">
+  <w:style w:type="character" w:customStyle="1" w:styleId="144">
     <w:name w:val="Subtitle Char"/>
     <w:basedOn w:val="133"/>
     <w:link w:val="26"/>
@@ -16929,7 +17319,7 @@
       </w14:textFill>
     </w:rPr>
   </w:style>
-  <w:style w:type="paragraph" w:styleId="144">
+  <w:style w:type="paragraph" w:styleId="145">
     <w:name w:val="List Paragraph"/>
     <w:basedOn w:val="1"/>
     <w:qFormat/>
@@ -16939,20 +17329,20 @@
       <w:contextualSpacing/>
     </w:pPr>
   </w:style>
-  <w:style w:type="character" w:customStyle="1" w:styleId="145">
+  <w:style w:type="character" w:customStyle="1" w:styleId="146">
     <w:name w:val="Body Text Char"/>
     <w:basedOn w:val="133"/>
     <w:link w:val="19"/>
     <w:uiPriority w:val="99"/>
   </w:style>
-  <w:style w:type="character" w:customStyle="1" w:styleId="146">
+  <w:style w:type="character" w:customStyle="1" w:styleId="147">
     <w:name w:val="Body Text 2 Char"/>
     <w:basedOn w:val="133"/>
     <w:link w:val="28"/>
     <w:qFormat/>
     <w:uiPriority w:val="99"/>
   </w:style>
-  <w:style w:type="character" w:customStyle="1" w:styleId="147">
+  <w:style w:type="character" w:customStyle="1" w:styleId="148">
     <w:name w:val="Body Text 3 Char"/>
     <w:basedOn w:val="133"/>
     <w:link w:val="17"/>
@@ -16962,7 +17352,7 @@
       <w:szCs w:val="16"/>
     </w:rPr>
   </w:style>
-  <w:style w:type="character" w:customStyle="1" w:styleId="148">
+  <w:style w:type="character" w:customStyle="1" w:styleId="149">
     <w:name w:val="Macro Text Char"/>
     <w:basedOn w:val="133"/>
     <w:link w:val="2"/>
@@ -16973,10 +17363,27 @@
       <w:szCs w:val="20"/>
     </w:rPr>
   </w:style>
-  <w:style w:type="paragraph" w:styleId="149">
+  <w:style w:type="paragraph" w:styleId="150">
     <w:name w:val="Quote"/>
     <w:basedOn w:val="1"/>
     <w:next w:val="1"/>
+    <w:link w:val="151"/>
+    <w:qFormat/>
+    <w:uiPriority w:val="29"/>
+    <w:rPr>
+      <w:i/>
+      <w:iCs/>
+      <w:color w:val="000000" w:themeColor="text1"/>
+      <w14:textFill>
+        <w14:solidFill>
+          <w14:schemeClr w14:val="tx1"/>
+        </w14:solidFill>
+      </w14:textFill>
+    </w:rPr>
+  </w:style>
+  <w:style w:type="character" w:customStyle="1" w:styleId="151">
+    <w:name w:val="Quote Char"/>
+    <w:basedOn w:val="133"/>
     <w:link w:val="150"/>
     <w:qFormat/>
     <w:uiPriority w:val="29"/>
@@ -16991,24 +17398,7 @@
       </w14:textFill>
     </w:rPr>
   </w:style>
-  <w:style w:type="character" w:customStyle="1" w:styleId="150">
-    <w:name w:val="Quote Char"/>
-    <w:basedOn w:val="133"/>
-    <w:link w:val="149"/>
-    <w:qFormat/>
-    <w:uiPriority w:val="29"/>
-    <w:rPr>
-      <w:i/>
-      <w:iCs/>
-      <w:color w:val="000000" w:themeColor="text1"/>
-      <w14:textFill>
-        <w14:solidFill>
-          <w14:schemeClr w14:val="tx1"/>
-        </w14:solidFill>
-      </w14:textFill>
-    </w:rPr>
-  </w:style>
-  <w:style w:type="character" w:customStyle="1" w:styleId="151">
+  <w:style w:type="character" w:customStyle="1" w:styleId="152">
     <w:name w:val="Heading 4 Char"/>
     <w:basedOn w:val="133"/>
     <w:link w:val="6"/>
@@ -17028,7 +17418,7 @@
       </w14:textFill>
     </w:rPr>
   </w:style>
-  <w:style w:type="character" w:customStyle="1" w:styleId="152">
+  <w:style w:type="character" w:customStyle="1" w:styleId="153">
     <w:name w:val="Heading 5 Char"/>
     <w:basedOn w:val="133"/>
     <w:link w:val="7"/>
@@ -17039,7 +17429,7 @@
       <w:color w:val="254061" w:themeColor="accent1" w:themeShade="80"/>
     </w:rPr>
   </w:style>
-  <w:style w:type="character" w:customStyle="1" w:styleId="153">
+  <w:style w:type="character" w:customStyle="1" w:styleId="154">
     <w:name w:val="Heading 6 Char"/>
     <w:basedOn w:val="133"/>
     <w:link w:val="8"/>
@@ -17053,7 +17443,7 @@
       <w:color w:val="254061" w:themeColor="accent1" w:themeShade="80"/>
     </w:rPr>
   </w:style>
-  <w:style w:type="character" w:customStyle="1" w:styleId="154">
+  <w:style w:type="character" w:customStyle="1" w:styleId="155">
     <w:name w:val="Heading 7 Char"/>
     <w:basedOn w:val="133"/>
     <w:link w:val="9"/>
@@ -17075,7 +17465,7 @@
       </w14:textFill>
     </w:rPr>
   </w:style>
-  <w:style w:type="character" w:customStyle="1" w:styleId="155">
+  <w:style w:type="character" w:customStyle="1" w:styleId="156">
     <w:name w:val="Heading 8 Char"/>
     <w:basedOn w:val="133"/>
     <w:link w:val="10"/>
@@ -17094,7 +17484,7 @@
       </w14:textFill>
     </w:rPr>
   </w:style>
-  <w:style w:type="character" w:customStyle="1" w:styleId="156">
+  <w:style w:type="character" w:customStyle="1" w:styleId="157">
     <w:name w:val="Heading 9 Char"/>
     <w:basedOn w:val="133"/>
     <w:link w:val="11"/>
@@ -17118,11 +17508,11 @@
       </w14:textFill>
     </w:rPr>
   </w:style>
-  <w:style w:type="paragraph" w:styleId="157">
+  <w:style w:type="paragraph" w:styleId="158">
     <w:name w:val="Intense Quote"/>
     <w:basedOn w:val="1"/>
     <w:next w:val="1"/>
-    <w:link w:val="158"/>
+    <w:link w:val="159"/>
     <w:qFormat/>
     <w:uiPriority w:val="30"/>
     <w:pPr>
@@ -17145,10 +17535,10 @@
       </w14:textFill>
     </w:rPr>
   </w:style>
-  <w:style w:type="character" w:customStyle="1" w:styleId="158">
+  <w:style w:type="character" w:customStyle="1" w:styleId="159">
     <w:name w:val="Intense Quote Char"/>
     <w:basedOn w:val="133"/>
-    <w:link w:val="157"/>
+    <w:link w:val="158"/>
     <w:qFormat/>
     <w:uiPriority w:val="30"/>
     <w:rPr>
@@ -17164,7 +17554,7 @@
       </w14:textFill>
     </w:rPr>
   </w:style>
-  <w:style w:type="character" w:customStyle="1" w:styleId="159">
+  <w:style w:type="character" w:customStyle="1" w:styleId="160">
     <w:name w:val="Subtle Emphasis"/>
     <w:basedOn w:val="133"/>
     <w:qFormat/>
@@ -17183,7 +17573,7 @@
       </w14:textFill>
     </w:rPr>
   </w:style>
-  <w:style w:type="character" w:customStyle="1" w:styleId="160">
+  <w:style w:type="character" w:customStyle="1" w:styleId="161">
     <w:name w:val="Intense Emphasis"/>
     <w:basedOn w:val="133"/>
     <w:qFormat/>
@@ -17201,7 +17591,7 @@
       </w14:textFill>
     </w:rPr>
   </w:style>
-  <w:style w:type="character" w:customStyle="1" w:styleId="161">
+  <w:style w:type="character" w:customStyle="1" w:styleId="162">
     <w:name w:val="Subtle Reference"/>
     <w:basedOn w:val="133"/>
     <w:qFormat/>
@@ -17217,7 +17607,7 @@
       </w14:textFill>
     </w:rPr>
   </w:style>
-  <w:style w:type="character" w:customStyle="1" w:styleId="162">
+  <w:style w:type="character" w:customStyle="1" w:styleId="163">
     <w:name w:val="Intense Reference"/>
     <w:basedOn w:val="133"/>
     <w:qFormat/>
@@ -17236,7 +17626,7 @@
       </w14:textFill>
     </w:rPr>
   </w:style>
-  <w:style w:type="character" w:customStyle="1" w:styleId="163">
+  <w:style w:type="character" w:customStyle="1" w:styleId="164">
     <w:name w:val="Book Title"/>
     <w:basedOn w:val="133"/>
     <w:qFormat/>
@@ -17248,7 +17638,7 @@
       <w:spacing w:val="5"/>
     </w:rPr>
   </w:style>
-  <w:style w:type="paragraph" w:customStyle="1" w:styleId="164">
+  <w:style w:type="paragraph" w:customStyle="1" w:styleId="165">
     <w:name w:val="TOC Heading"/>
     <w:basedOn w:val="3"/>
     <w:next w:val="1"/>

</xml_diff>